<commit_message>
Common API-ban az aláírás generálásnál felhívás a kliens idő ellenőrzésére hiba esetén.
</commit_message>
<xml_diff>
--- a/docs/spec/M2M általános interfész specifikáció 0.4.docx
+++ b/docs/spec/M2M általános interfész specifikáció 0.4.docx
@@ -9478,6 +9478,47 @@
     </w:p>
     <w:p>
       <w:pPr>
+        <w:jc w:val="both"/>
+      </w:pPr>
+      <w:r>
+        <w:rPr>
+          <w:b/>
+          <w:bCs/>
+        </w:rPr>
+        <w:t>Fontos</w:t>
+      </w:r>
+      <w:r>
+        <w:t xml:space="preserve"> </w:t>
+      </w:r>
+      <w:r>
+        <w:rPr>
+          <w:b/>
+          <w:bCs/>
+        </w:rPr>
+        <w:t>megjegyezni</w:t>
+      </w:r>
+      <w:r>
+        <w:t xml:space="preserve">, hogy lehetnek olyan esetek amikor a kliens eszközön a rendszeridő eltér az aktuális pontos időtől. Ha a kliens idő előrébb jár, mint az aktuális idő, akkor az időbélyeg generálásnál olyan érték állhat elő, amit az M2M szerver nem fog ellenőrizni. Emiatt kérjük, hogyha </w:t>
+      </w:r>
+      <w:proofErr w:type="spellStart"/>
+      <w:r>
+        <w:t>invalid</w:t>
+      </w:r>
+      <w:proofErr w:type="spellEnd"/>
+      <w:r>
+        <w:t xml:space="preserve"> </w:t>
+      </w:r>
+      <w:proofErr w:type="spellStart"/>
+      <w:r>
+        <w:t>signature</w:t>
+      </w:r>
+      <w:proofErr w:type="spellEnd"/>
+      <w:r>
+        <w:t xml:space="preserve"> válasz érkezik, akkor először a kliens rendszeridőt hasonlítsuk össze az interneten elérhető idő szolgáltatókkal.</w:t>
+      </w:r>
+    </w:p>
+    <w:p>
+      <w:pPr>
         <w:pStyle w:val="Cmsor2"/>
         <w:numPr>
           <w:ilvl w:val="2"/>
@@ -9498,6 +9539,7 @@
           <w:sz w:val="24"/>
           <w:szCs w:val="24"/>
         </w:rPr>
+        <w:lastRenderedPageBreak/>
         <w:t>Minták</w:t>
       </w:r>
       <w:bookmarkEnd w:id="45"/>
@@ -9531,11 +9573,7 @@
       </w:r>
       <w:proofErr w:type="spellEnd"/>
       <w:r>
-        <w:t xml:space="preserve">, aláírás) is megadjuk a használt mintát, ahol ez nem kerül az interfészbe. Ilyenkor adatátadásnál nem elvárás az adott formátum, az adat későbbi használata során viszont hibák keletkezhetnek. Ezen adatok </w:t>
-      </w:r>
-      <w:r>
-        <w:lastRenderedPageBreak/>
-        <w:t>formátumának megváltozása nem jár új interfészkiadással, ezért az arra épülő vizsgálatok beépítése nem javasolt.</w:t>
+        <w:t>, aláírás) is megadjuk a használt mintát, ahol ez nem kerül az interfészbe. Ilyenkor adatátadásnál nem elvárás az adott formátum, az adat későbbi használata során viszont hibák keletkezhetnek. Ezen adatok formátumának megváltozása nem jár új interfészkiadással, ezért az arra épülő vizsgálatok beépítése nem javasolt.</w:t>
       </w:r>
     </w:p>
     <w:p>
@@ -10604,6 +10642,7 @@
           <w:sz w:val="24"/>
           <w:szCs w:val="24"/>
         </w:rPr>
+        <w:lastRenderedPageBreak/>
         <w:t>Válaszidő</w:t>
       </w:r>
       <w:bookmarkEnd w:id="51"/>
@@ -10687,11 +10726,7 @@
         <w:jc w:val="both"/>
       </w:pPr>
       <w:r>
-        <w:t xml:space="preserve">A szerver az időbeállításokat egy zárt, a külvilág számára nem hozzáférhető NTP szervertől kapja. Kliens oldalon a szerveridőhöz szinkronizálás nem követelmény, azonban opcionálisan a következő </w:t>
-      </w:r>
-      <w:r>
-        <w:lastRenderedPageBreak/>
-        <w:t>időszinkronizáció lehetséges: http://www.pool.ntp.org/zone/hu (a csatlakozáshoz NTP kliensre van szükség).</w:t>
+        <w:t>A szerver az időbeállításokat egy zárt, a külvilág számára nem hozzáférhető NTP szervertől kapja. Kliens oldalon a szerveridőhöz szinkronizálás nem követelmény, azonban opcionálisan a következő időszinkronizáció lehetséges: http://www.pool.ntp.org/zone/hu (a csatlakozáshoz NTP kliensre van szükség).</w:t>
       </w:r>
     </w:p>
     <w:p>
@@ -24759,18 +24794,18 @@
 </file>
 
 <file path=customXml/item2.xml><?xml version="1.0" encoding="utf-8"?>
-<p:properties xmlns:p="http://schemas.microsoft.com/office/2006/metadata/properties" xmlns:xsi="http://www.w3.org/2001/XMLSchema-instance" xmlns:pc="http://schemas.microsoft.com/office/infopath/2007/PartnerControls">
-  <documentManagement/>
-</p:properties>
-</file>
-
-<file path=customXml/item3.xml><?xml version="1.0" encoding="utf-8"?>
 <?mso-contentType ?>
 <FormTemplates xmlns="http://schemas.microsoft.com/sharepoint/v3/contenttype/forms">
   <Display>DocumentLibraryForm</Display>
   <Edit>DocumentLibraryForm</Edit>
   <New>DocumentLibraryForm</New>
 </FormTemplates>
+</file>
+
+<file path=customXml/item3.xml><?xml version="1.0" encoding="utf-8"?>
+<p:properties xmlns:p="http://schemas.microsoft.com/office/2006/metadata/properties" xmlns:xsi="http://www.w3.org/2001/XMLSchema-instance" xmlns:pc="http://schemas.microsoft.com/office/infopath/2007/PartnerControls">
+  <documentManagement/>
+</p:properties>
 </file>
 
 <file path=customXml/itemProps1.xml><?xml version="1.0" encoding="utf-8"?>
@@ -24790,18 +24825,18 @@
 </file>
 
 <file path=customXml/itemProps2.xml><?xml version="1.0" encoding="utf-8"?>
+<ds:datastoreItem xmlns:ds="http://schemas.openxmlformats.org/officeDocument/2006/customXml" ds:itemID="{3252795C-C61F-47A1-92CC-B6DF90C96B20}">
+  <ds:schemaRefs>
+    <ds:schemaRef ds:uri="http://schemas.microsoft.com/sharepoint/v3/contenttype/forms"/>
+  </ds:schemaRefs>
+</ds:datastoreItem>
+</file>
+
+<file path=customXml/itemProps3.xml><?xml version="1.0" encoding="utf-8"?>
 <ds:datastoreItem xmlns:ds="http://schemas.openxmlformats.org/officeDocument/2006/customXml" ds:itemID="{F0DAD644-A4E0-433A-A53A-F69EC61A370B}">
   <ds:schemaRefs>
     <ds:schemaRef ds:uri="http://schemas.microsoft.com/office/2006/metadata/properties"/>
     <ds:schemaRef ds:uri="http://schemas.microsoft.com/office/infopath/2007/PartnerControls"/>
   </ds:schemaRefs>
 </ds:datastoreItem>
-</file>
-
-<file path=customXml/itemProps3.xml><?xml version="1.0" encoding="utf-8"?>
-<ds:datastoreItem xmlns:ds="http://schemas.openxmlformats.org/officeDocument/2006/customXml" ds:itemID="{3252795C-C61F-47A1-92CC-B6DF90C96B20}">
-  <ds:schemaRefs>
-    <ds:schemaRef ds:uri="http://schemas.microsoft.com/sharepoint/v3/contenttype/forms"/>
-  </ds:schemaRefs>
-</ds:datastoreItem>
 </file>
</xml_diff>